<commit_message>
Profile: confirm daily product demos (all tech sales roles) and tradeshows (Accelo, Birdeye, Level). KEV resume updated, score 68
Co-Authored-By: Claude Opus 5.5 <noreply@anthropic.com>
Claude-Session: https://claude.ai/code/session_01Quz1wQsVbycgj85WWSYfNT
</commit_message>
<xml_diff>
--- a/applications/kev-group-solutions-engineer/resume.docx
+++ b/applications/kev-group-solutions-engineer/resume.docx
@@ -80,7 +80,7 @@
           <w:i w:val="0"/>
           <w:color w:val="1A1A1A"/>
         </w:rPr>
-        <w:t>Technical sales and solutions professional with 15+ years in B2B SaaS, translating complex software into solutions that technical and non-technical buyers both understand. At Accelo, scoped CRM/PSA solutions for agencies and professional-services firms, built sequenced implementation plans, and guided API integrations as a trusted advisor to C-suite clients, ranking top three in sales while quota doubled. Designs CRM, automation, and LLM-based agent systems hands-on (APIs, SQL, Python and JavaScript code steps), and routes structured customer feedback into product roadmaps.</w:t>
+        <w:t>Technical sales and solutions professional with 15+ years in B2B SaaS, running live product demos daily and translating complex software into solutions that technical and non-technical buyers both understand. At Accelo, scoped CRM/PSA solutions for agencies and professional-services firms, built sequenced implementation plans, and guided API integrations as a trusted advisor to C-suite clients, ranking top three in sales while quota doubled. Designs CRM, automation, and LLM-based agent systems hands-on (APIs, SQL, Python and JavaScript code steps), and routes structured customer feedback into product roadmaps.</w:t>
       </w:r>
     </w:p>
     <w:p>
@@ -380,6 +380,30 @@
     </w:p>
     <w:p>
       <w:pPr>
+        <w:spacing w:after="30"/>
+        <w:ind w:left="259" w:hanging="259"/>
+      </w:pPr>
+      <w:r>
+        <w:rPr>
+          <w:rFonts w:ascii="Calibri" w:hAnsi="Calibri"/>
+          <w:b w:val="0"/>
+          <w:i w:val="0"/>
+          <w:color w:val="163A5F"/>
+        </w:rPr>
+        <w:t xml:space="preserve">•  </w:t>
+      </w:r>
+      <w:r>
+        <w:rPr>
+          <w:rFonts w:ascii="Calibri" w:hAnsi="Calibri"/>
+          <w:b w:val="0"/>
+          <w:i w:val="0"/>
+          <w:color w:val="1A1A1A"/>
+        </w:rPr>
+        <w:t>Represented Level Agency at industry events.</w:t>
+      </w:r>
+    </w:p>
+    <w:p>
+      <w:pPr>
         <w:tabs>
           <w:tab w:pos="10512" w:val="right"/>
         </w:tabs>
@@ -430,6 +454,30 @@
           <w:sz w:val="18"/>
         </w:rPr>
         <w:t>Remote</w:t>
+      </w:r>
+    </w:p>
+    <w:p>
+      <w:pPr>
+        <w:spacing w:after="30"/>
+        <w:ind w:left="259" w:hanging="259"/>
+      </w:pPr>
+      <w:r>
+        <w:rPr>
+          <w:rFonts w:ascii="Calibri" w:hAnsi="Calibri"/>
+          <w:b w:val="0"/>
+          <w:i w:val="0"/>
+          <w:color w:val="163A5F"/>
+        </w:rPr>
+        <w:t xml:space="preserve">•  </w:t>
+      </w:r>
+      <w:r>
+        <w:rPr>
+          <w:rFonts w:ascii="Calibri" w:hAnsi="Calibri"/>
+          <w:b w:val="0"/>
+          <w:i w:val="0"/>
+          <w:color w:val="1A1A1A"/>
+        </w:rPr>
+        <w:t>Ran daily product demos for prospective partners and customers, and represented Birdeye at tradeshows and events.</w:t>
       </w:r>
     </w:p>
     <w:p>
@@ -681,7 +729,7 @@
           <w:i w:val="0"/>
           <w:color w:val="1A1A1A"/>
         </w:rPr>
-        <w:t>Carried a combined sales and implementation load, holding 120% of sales targets and 110% of implementation targets while launching 25+ clients per month.</w:t>
+        <w:t>Ran daily product demos while carrying a combined sales and implementation load, holding 120% of sales targets and 110% of implementation targets and launching 25+ clients per month.</w:t>
       </w:r>
     </w:p>
     <w:p>
@@ -807,6 +855,30 @@
           <w:i w:val="0"/>
           <w:color w:val="1A1A1A"/>
         </w:rPr>
+        <w:t>Delivered live product demos daily to agency and professional-services buyers, tailoring each to the technical and operational stakeholders in the room.</w:t>
+      </w:r>
+    </w:p>
+    <w:p>
+      <w:pPr>
+        <w:spacing w:after="30"/>
+        <w:ind w:left="259" w:hanging="259"/>
+      </w:pPr>
+      <w:r>
+        <w:rPr>
+          <w:rFonts w:ascii="Calibri" w:hAnsi="Calibri"/>
+          <w:b w:val="0"/>
+          <w:i w:val="0"/>
+          <w:color w:val="163A5F"/>
+        </w:rPr>
+        <w:t xml:space="preserve">•  </w:t>
+      </w:r>
+      <w:r>
+        <w:rPr>
+          <w:rFonts w:ascii="Calibri" w:hAnsi="Calibri"/>
+          <w:b w:val="0"/>
+          <w:i w:val="0"/>
+          <w:color w:val="1A1A1A"/>
+        </w:rPr>
         <w:t>Sold and scoped Accelo's CRM and project-management platform to agencies and professional-services firms, with deep fluency in pipeline automation and workflow configuration.</w:t>
       </w:r>
     </w:p>
@@ -903,7 +975,7 @@
           <w:i w:val="0"/>
           <w:color w:val="1A1A1A"/>
         </w:rPr>
-        <w:t>Built Zapier automations and tracked customer issues through Zendesk.</w:t>
+        <w:t>Represented Accelo at tradeshows and events, built Zapier automations, and tracked customer issues through Zendesk.</w:t>
       </w:r>
     </w:p>
     <w:p>
@@ -945,7 +1017,7 @@
           <w:i w:val="0"/>
           <w:color w:val="1A1A1A"/>
         </w:rPr>
-        <w:t>Discovery &amp; Solution Design, Technical Scoping, Proposals &amp; SOWs, Account Planning with AEs, Sales Enablement &amp; Training, Product Feedback Loops</w:t>
+        <w:t>Live Product Demos, Discovery &amp; Solution Design, Technical Scoping, Proposals &amp; SOWs, Account Planning with AEs, Sales Enablement &amp; Training, Product Feedback Loops, Tradeshows &amp; Events</w:t>
       </w:r>
     </w:p>
     <w:p>

</xml_diff>